<commit_message>
Remove agreement subtitle line from Student AI Agreement Word doc
Matches the same line already removed from the PDF versions
(standalone, Fast-Start Bundle, and Starter Kit).

Co-Authored-By: Claude Sonnet 5 <noreply@anthropic.com>
Claude-Session: https://claude.ai/code/session_01MWkywYWmSZodCjWuYpXcox
</commit_message>
<xml_diff>
--- a/assets/teach/Student-AI-Agreement.docx
+++ b/assets/teach/Student-AI-Agreement.docx
@@ -16,25 +16,6 @@
           <w:szCs w:val="34"/>
         </w:rPr>
         <w:t xml:space="preserve">Our Class AI Agreement</w:t>
-      </w:r>
-    </w:p>
-    <w:p>
-      <w:pPr>
-        <w:pBdr>
-          <w:bottom w:val="single" w:color="E9B45B" w:sz="6" w:space="6"/>
-        </w:pBdr>
-        <w:spacing w:after="200" w:before="0"/>
-      </w:pPr>
-      <w:r>
-        <w:rPr>
-          <w:rFonts w:ascii="Calibri" w:cs="Calibri" w:eastAsia="Calibri" w:hAnsi="Calibri"/>
-          <w:i/>
-          <w:iCs/>
-          <w:color w:val="09356D"/>
-          <w:sz w:val="22"/>
-          <w:szCs w:val="22"/>
-        </w:rPr>
-        <w:t xml:space="preserve">Review together, discuss aloud, then sign. The conversation matters more than the signatures.</w:t>
       </w:r>
     </w:p>
     <w:p>

</xml_diff>